<commit_message>
updated report, need a couple more hours to finish
</commit_message>
<xml_diff>
--- a/Microcontroller_Basics/report/Microcontroller_Basics_Report.docx
+++ b/Microcontroller_Basics/report/Microcontroller_Basics_Report.docx
@@ -150,7 +150,8 @@
       <w:pPr>
         <w:spacing w:after="0"/>
         <w:rPr>
-          <w:sz w:val="24"/>
+          <w:b/>
+          <w:bCs/>
         </w:rPr>
       </w:pPr>
       <w:r>
@@ -161,24 +162,55 @@
         <w:tab/>
       </w:r>
       <w:r>
-        <w:rPr>
-          <w:sz w:val="24"/>
-        </w:rPr>
-        <w:t xml:space="preserve">This module was a thorough introduction into the embedded systems / firmware design flow process. The lab focused entirely on programming the </w:t>
+        <w:t>This module was a thorough introduction into the embedded systems / firmware design flow process</w:t>
+      </w:r>
+      <w:r>
+        <w:t xml:space="preserve"> with a microcontroller</w:t>
+      </w:r>
+      <w:r>
+        <w:t>.</w:t>
+      </w:r>
+      <w:r>
+        <w:t xml:space="preserve"> A microcontroller is a device with multiple modules that connect to a microprocessor (single-chip CPU) like the </w:t>
       </w:r>
       <w:r>
         <w:rPr>
           <w:b/>
           <w:bCs/>
-          <w:sz w:val="24"/>
-        </w:rPr>
-        <w:t>Raspberry Pi Pico 2 Microcontoller</w:t>
-      </w:r>
-      <w:r>
-        <w:rPr>
-          <w:sz w:val="24"/>
-        </w:rPr>
-        <w:t xml:space="preserve"> and using it for a two simple processes: blinking an LED and toggling a Piezo Buzzer. </w:t>
+        </w:rPr>
+        <w:t xml:space="preserve">RP2350. </w:t>
+      </w:r>
+      <w:r>
+        <w:t xml:space="preserve"> The lab focused entirely on programming the </w:t>
+      </w:r>
+      <w:r>
+        <w:rPr>
+          <w:b/>
+          <w:bCs/>
+        </w:rPr>
+        <w:t xml:space="preserve">Raspberry Pi Pico 2 </w:t>
+      </w:r>
+      <w:r>
+        <w:rPr>
+          <w:b/>
+          <w:bCs/>
+        </w:rPr>
+        <w:t>Microcontroller</w:t>
+      </w:r>
+      <w:r>
+        <w:t xml:space="preserve"> and using it for </w:t>
+      </w:r>
+      <w:r>
+        <w:t>two</w:t>
+      </w:r>
+      <w:r>
+        <w:t xml:space="preserve"> simple processes: blinking an </w:t>
+      </w:r>
+      <w:r>
+        <w:t>LED</w:t>
+      </w:r>
+      <w:r>
+        <w:t xml:space="preserve"> and toggling a Piezo Buzzer. </w:t>
       </w:r>
     </w:p>
     <w:p>
@@ -208,120 +240,82 @@
     </w:p>
     <w:p>
       <w:pPr>
-        <w:spacing w:after="0"/>
-        <w:ind w:firstLine="720"/>
-        <w:rPr>
-          <w:sz w:val="24"/>
-        </w:rPr>
-      </w:pPr>
-      <w:r>
-        <w:rPr>
-          <w:sz w:val="24"/>
-        </w:rPr>
-        <w:t xml:space="preserve">The </w:t>
-      </w:r>
-      <w:r>
-        <w:rPr>
-          <w:sz w:val="24"/>
-        </w:rPr>
-        <w:t xml:space="preserve">methods section should include all background information needed for the </w:t>
-      </w:r>
-      <w:r>
-        <w:rPr>
-          <w:sz w:val="24"/>
-        </w:rPr>
-        <w:t>design</w:t>
-      </w:r>
-      <w:r>
-        <w:rPr>
-          <w:sz w:val="24"/>
-        </w:rPr>
-        <w:t xml:space="preserve"> and steps used to create the </w:t>
-      </w:r>
-      <w:r>
-        <w:rPr>
-          <w:sz w:val="24"/>
-        </w:rPr>
-        <w:t>results</w:t>
-      </w:r>
-      <w:r>
-        <w:rPr>
-          <w:sz w:val="24"/>
-        </w:rPr>
-        <w:t>.</w:t>
-      </w:r>
-      <w:r>
-        <w:rPr>
-          <w:sz w:val="24"/>
-        </w:rPr>
+        <w:pStyle w:val="ListParagraph"/>
+        <w:keepNext/>
+        <w:spacing w:after="0"/>
+        <w:ind w:left="0"/>
+        <w:rPr>
+          <w:u w:val="single"/>
+        </w:rPr>
+      </w:pPr>
+    </w:p>
+    <w:p>
+      <w:pPr>
+        <w:pStyle w:val="ListParagraph"/>
+        <w:keepNext/>
+        <w:spacing w:after="0"/>
+        <w:ind w:left="0"/>
+        <w:rPr>
+          <w:sz w:val="24"/>
+          <w:szCs w:val="24"/>
+          <w:u w:val="single"/>
+        </w:rPr>
+      </w:pPr>
+      <w:r>
+        <w:rPr>
+          <w:sz w:val="24"/>
+          <w:szCs w:val="24"/>
+          <w:u w:val="single"/>
+        </w:rPr>
+        <w:t xml:space="preserve">Background Information: </w:t>
+      </w:r>
+    </w:p>
+    <w:p>
+      <w:pPr>
+        <w:pStyle w:val="ListParagraph"/>
+        <w:spacing w:after="0"/>
+        <w:ind w:left="0"/>
+      </w:pPr>
+      <w:r>
+        <w:t xml:space="preserve">This design implements the Raspberry Pi Pico 2 microcontroller alongside a </w:t>
+      </w:r>
+      <w:r>
+        <w:t>LED</w:t>
+      </w:r>
+      <w:r>
+        <w:t xml:space="preserve">, piezo buzzer, a potentiometer, a switch, and 2 resistors. The project is deliberately simple to flatten the curve of the </w:t>
+      </w:r>
+      <w:r>
+        <w:t>e</w:t>
+      </w:r>
+      <w:r>
+        <w:t xml:space="preserve">mbedded design process. </w:t>
+      </w:r>
+      <w:r>
+        <w:t>Therefore, the number of components is much smaller than for later projects or even the final project for this course.</w:t>
+      </w:r>
+      <w:r>
         <w:t xml:space="preserve"> </w:t>
       </w:r>
-      <w:r>
-        <w:rPr>
-          <w:sz w:val="24"/>
-        </w:rPr>
-        <w:t xml:space="preserve">Please cite any references used. Use </w:t>
-      </w:r>
-      <w:r>
-        <w:rPr>
-          <w:sz w:val="24"/>
-        </w:rPr>
-        <w:t>s</w:t>
-      </w:r>
-      <w:r>
-        <w:rPr>
-          <w:sz w:val="24"/>
-        </w:rPr>
-        <w:t>ubheadings as necessary.</w:t>
-      </w:r>
-      <w:r>
-        <w:rPr>
-          <w:sz w:val="24"/>
-        </w:rPr>
-        <w:t xml:space="preserve"> Pictures of neat breadboard implementations </w:t>
-      </w:r>
-      <w:r>
-        <w:rPr>
-          <w:sz w:val="24"/>
-        </w:rPr>
-        <w:t xml:space="preserve">of the </w:t>
-      </w:r>
-      <w:r>
-        <w:rPr>
-          <w:sz w:val="24"/>
-        </w:rPr>
-        <w:t>circuits</w:t>
-      </w:r>
-      <w:r>
-        <w:rPr>
-          <w:sz w:val="24"/>
-        </w:rPr>
-        <w:t xml:space="preserve"> </w:t>
-      </w:r>
-      <w:r>
-        <w:rPr>
-          <w:sz w:val="24"/>
-        </w:rPr>
-        <w:t>could also be included in this section.</w:t>
-      </w:r>
-    </w:p>
-    <w:p>
-      <w:pPr>
-        <w:spacing w:after="0"/>
-        <w:ind w:firstLine="720"/>
-        <w:rPr>
-          <w:i/>
-          <w:iCs/>
-          <w:sz w:val="24"/>
-        </w:rPr>
-      </w:pPr>
-      <w:r>
-        <w:rPr>
-          <w:i/>
-          <w:iCs/>
-          <w:sz w:val="24"/>
-        </w:rPr>
-        <w:t>The Figures you will need is this section are the following:</w:t>
+    </w:p>
+    <w:p>
+      <w:pPr>
+        <w:pStyle w:val="ListParagraph"/>
+        <w:spacing w:after="0"/>
+        <w:ind w:left="0" w:firstLine="720"/>
+      </w:pPr>
+      <w:r>
+        <w:t xml:space="preserve">The most important component is the Raspberry Pi Pico 2 which is a microcontroller board that houses the </w:t>
+      </w:r>
+      <w:r>
+        <w:rPr>
+          <w:b/>
+          <w:bCs/>
+        </w:rPr>
+        <w:t>RP2350 microcontroller chip</w:t>
+      </w:r>
+      <w:r>
+        <w:t xml:space="preserve">. The RP2350 is a more powerful version of the RP2040 chip on the Raspberry Pi Pico that has these specifications (specs): </w:t>
       </w:r>
     </w:p>
     <w:p>
@@ -329,30 +323,12 @@
         <w:pStyle w:val="ListParagraph"/>
         <w:numPr>
           <w:ilvl w:val="0"/>
-          <w:numId w:val="5"/>
+          <w:numId w:val="8"/>
         </w:numPr>
         <w:spacing w:after="0"/>
-        <w:rPr>
-          <w:i/>
-          <w:iCs/>
-          <w:sz w:val="24"/>
-        </w:rPr>
-      </w:pPr>
-      <w:r>
-        <w:rPr>
-          <w:i/>
-          <w:iCs/>
-          <w:sz w:val="24"/>
-        </w:rPr>
-        <w:t>Altium schematic of your circuit</w:t>
-      </w:r>
-      <w:r>
-        <w:rPr>
-          <w:i/>
-          <w:iCs/>
-          <w:sz w:val="24"/>
-        </w:rPr>
-        <w:t xml:space="preserve"> (by doing an Altium schematic now, you will save time in the Final Project)</w:t>
+      </w:pPr>
+      <w:r>
+        <w:t>Dual-Cortex M33 Processors at 150MHz</w:t>
       </w:r>
     </w:p>
     <w:p>
@@ -360,22 +336,12 @@
         <w:pStyle w:val="ListParagraph"/>
         <w:numPr>
           <w:ilvl w:val="0"/>
-          <w:numId w:val="5"/>
+          <w:numId w:val="8"/>
         </w:numPr>
         <w:spacing w:after="0"/>
-        <w:rPr>
-          <w:i/>
-          <w:iCs/>
-          <w:sz w:val="24"/>
-        </w:rPr>
-      </w:pPr>
-      <w:r>
-        <w:rPr>
-          <w:i/>
-          <w:iCs/>
-          <w:sz w:val="24"/>
-        </w:rPr>
-        <w:t>Block diagram of hardware</w:t>
+      </w:pPr>
+      <w:r>
+        <w:t>520 kB of on-chip SRAM</w:t>
       </w:r>
     </w:p>
     <w:p>
@@ -383,69 +349,166 @@
         <w:pStyle w:val="ListParagraph"/>
         <w:numPr>
           <w:ilvl w:val="0"/>
-          <w:numId w:val="5"/>
+          <w:numId w:val="8"/>
         </w:numPr>
         <w:spacing w:after="0"/>
-        <w:rPr>
-          <w:i/>
-          <w:iCs/>
-          <w:sz w:val="24"/>
-        </w:rPr>
-      </w:pPr>
-      <w:r>
-        <w:rPr>
-          <w:i/>
-          <w:iCs/>
-          <w:sz w:val="24"/>
-        </w:rPr>
-        <w:t>Block diagram of code</w:t>
-      </w:r>
-      <w:r>
-        <w:rPr>
-          <w:i/>
-          <w:iCs/>
-          <w:sz w:val="24"/>
-        </w:rPr>
-        <w:t xml:space="preserve"> sequence</w:t>
+      </w:pPr>
+      <w:r>
+        <w:t>GPIOs are 5 V-tolerant (powered) and 3.3 V-failsafe (unpowered)</w:t>
       </w:r>
     </w:p>
     <w:p>
       <w:pPr>
         <w:pStyle w:val="ListParagraph"/>
-        <w:spacing w:after="0"/>
-        <w:ind w:left="1080"/>
-        <w:rPr>
-          <w:i/>
-          <w:iCs/>
-          <w:sz w:val="24"/>
-        </w:rPr>
-      </w:pPr>
-      <w:r>
-        <w:rPr>
-          <w:i/>
-          <w:iCs/>
-          <w:noProof/>
-          <w:sz w:val="24"/>
-        </w:rPr>
+        <w:numPr>
+          <w:ilvl w:val="0"/>
+          <w:numId w:val="8"/>
+        </w:numPr>
+        <w:spacing w:after="0"/>
+      </w:pPr>
+      <w:r>
+        <w:t>Peripherals:</w:t>
+      </w:r>
+    </w:p>
+    <w:p>
+      <w:pPr>
+        <w:pStyle w:val="ListParagraph"/>
+        <w:numPr>
+          <w:ilvl w:val="1"/>
+          <w:numId w:val="8"/>
+        </w:numPr>
+        <w:spacing w:after="0"/>
+      </w:pPr>
+      <w:r>
+        <w:t>2 UART Channels</w:t>
+      </w:r>
+    </w:p>
+    <w:p>
+      <w:pPr>
+        <w:pStyle w:val="ListParagraph"/>
+        <w:numPr>
+          <w:ilvl w:val="1"/>
+          <w:numId w:val="8"/>
+        </w:numPr>
+        <w:spacing w:after="0"/>
+      </w:pPr>
+      <w:r>
+        <w:t xml:space="preserve">2 SPI Channels </w:t>
+      </w:r>
+    </w:p>
+    <w:p>
+      <w:pPr>
+        <w:pStyle w:val="ListParagraph"/>
+        <w:numPr>
+          <w:ilvl w:val="1"/>
+          <w:numId w:val="8"/>
+        </w:numPr>
+        <w:spacing w:after="0"/>
+      </w:pPr>
+      <w:r>
+        <w:t>2 I2C Channels</w:t>
+      </w:r>
+    </w:p>
+    <w:p>
+      <w:pPr>
+        <w:spacing w:after="0"/>
+      </w:pPr>
+      <w:r>
+        <w:t>Ultimately, these specifications are not the most vital when programming th</w:t>
+      </w:r>
+      <w:r>
+        <w:t xml:space="preserve">e Pico 2 for this lab, but they are important as they provide a greater insight into the internal architecture of a complex device like the RP2350 [1]. </w:t>
+      </w:r>
+    </w:p>
+    <w:p>
+      <w:pPr>
+        <w:spacing w:after="0"/>
+        <w:ind w:firstLine="720"/>
+        <w:rPr>
+          <w:b/>
+          <w:bCs/>
+        </w:rPr>
+      </w:pPr>
+      <w:r>
+        <w:t>Now, the term “microcontroller” has been used a few times up until this point without much of an explanation, so the following sentences will provide more information on that term. A microcontroller is very similar to a Central Processing Unit (CPU)</w:t>
+      </w:r>
+      <w:r>
+        <w:t xml:space="preserve">. The CPU is a part of a computer/system that is effectively “the ‘brain’ of a device” by performing arithmetic calculations, executing instructions, and controlling dataflow between the main device and peripherals [2]. The CPU is for a complete computing system and is a much larger scale than a smaller microcontroller. A </w:t>
+      </w:r>
+      <w:r>
+        <w:lastRenderedPageBreak/>
+        <w:t xml:space="preserve">microcontroller is essentially a CPU on an IC chip that also controls the Input/Output (IO) interface [3]. This makes a microcontroller a </w:t>
+      </w:r>
+      <w:r>
+        <w:t xml:space="preserve">fundamental </w:t>
+      </w:r>
+      <w:r>
+        <w:t>asset with a much smaller Non-Recurring Engineering (NRE) cost as it can be efficiently reproduced</w:t>
+      </w:r>
+      <w:r>
+        <w:t xml:space="preserve"> to be applied to a variety of situations. For example, the Raspberry Pi Pico 2 W is often also used for wireless capabilities, but it has the same chip as the regular Pico 2. The only difference lies in the peripherals on each board</w:t>
+      </w:r>
+      <w:r>
+        <w:t xml:space="preserve"> since the Pico 2 W has a powerful Infineon CYW43439 Chip that allows for BLE (Bluetooth Low Energy), Bluetooth, and Wi-Fi capabilities [4]. Therefore, microcontrollers can be flexible and powerful enough that they can work for a variety of different peripherals </w:t>
+      </w:r>
+      <w:r>
+        <w:t>if</w:t>
+      </w:r>
+      <w:r>
+        <w:t xml:space="preserve"> they </w:t>
+      </w:r>
+      <w:r>
+        <w:t>allow</w:t>
+      </w:r>
+      <w:r>
+        <w:t xml:space="preserve"> </w:t>
+      </w:r>
+      <w:r>
+        <w:rPr>
+          <w:b/>
+          <w:bCs/>
+        </w:rPr>
+        <w:t>pin multiplexing</w:t>
+      </w:r>
+      <w:r>
+        <w:t xml:space="preserve">, being able to configure a pin’s use for a different module. </w:t>
+      </w:r>
+      <w:r>
+        <w:rPr>
+          <w:b/>
+          <w:bCs/>
+        </w:rPr>
+        <w:t xml:space="preserve"> </w:t>
+      </w:r>
+      <w:r>
+        <w:rPr>
+          <w:b/>
+          <w:bCs/>
+        </w:rPr>
+        <w:t xml:space="preserve">These differences are emphasized by the different pinouts for Pico 2 and Pico 2 W as shown below. </w:t>
+      </w:r>
+    </w:p>
+    <w:p>
+      <w:pPr>
+        <w:keepNext/>
+        <w:spacing w:after="0"/>
+        <w:ind w:firstLine="720"/>
+        <w:jc w:val="center"/>
+      </w:pPr>
+    </w:p>
+    <w:p>
+      <w:pPr>
+        <w:keepNext/>
+        <w:spacing w:after="0"/>
+        <w:ind w:left="-576" w:firstLine="720"/>
+        <w:jc w:val="center"/>
+      </w:pPr>
+      <w:r>
         <w:drawing>
-          <wp:anchor distT="0" distB="0" distL="114300" distR="114300" simplePos="0" relativeHeight="251662336" behindDoc="0" locked="0" layoutInCell="1" allowOverlap="1" wp14:anchorId="31F82F60" wp14:editId="2E29772E">
-            <wp:simplePos x="0" y="0"/>
-            <wp:positionH relativeFrom="column">
-              <wp:posOffset>3357245</wp:posOffset>
-            </wp:positionH>
-            <wp:positionV relativeFrom="paragraph">
-              <wp:posOffset>213360</wp:posOffset>
-            </wp:positionV>
-            <wp:extent cx="1994535" cy="1795145"/>
-            <wp:effectExtent l="0" t="0" r="0" b="0"/>
-            <wp:wrapSquare wrapText="bothSides"/>
-            <wp:docPr id="12" name="Picture 6" descr="Design Flowchart In Programming (With Examples) - Programiz">
-              <a:extLst xmlns:a="http://schemas.openxmlformats.org/drawingml/2006/main">
-                <a:ext uri="{FF2B5EF4-FFF2-40B4-BE49-F238E27FC236}">
-                  <a16:creationId xmlns:a16="http://schemas.microsoft.com/office/drawing/2014/main" id="{2CA6C09E-F21A-CF4F-B9F3-CBA5AC84A555}"/>
-                </a:ext>
-              </a:extLst>
-            </wp:docPr>
+          <wp:inline distT="0" distB="0" distL="0" distR="0" wp14:anchorId="2151E7ED" wp14:editId="6BBEB292">
+            <wp:extent cx="4450715" cy="2391410"/>
+            <wp:effectExtent l="0" t="0" r="6985" b="8890"/>
+            <wp:docPr id="1480246914" name="Picture 1" descr="The image depicts a circuit diagram with various components including LEDs, microcontrollers (UART TX, RX, GP25, GP1, GP2, GP3, GP4, GP5, GP28, GP27, GP26, GP22), and various input/output connections such as SPI, SDA, SCL, VSYS, and ADC.&#10;&#10;AI-generated content may be incorrect."/>
             <wp:cNvGraphicFramePr>
               <a:graphicFrameLocks xmlns:a="http://schemas.openxmlformats.org/drawingml/2006/main" noChangeAspect="1"/>
             </wp:cNvGraphicFramePr>
@@ -453,16 +516,8 @@
               <a:graphicData uri="http://schemas.openxmlformats.org/drawingml/2006/picture">
                 <pic:pic xmlns:pic="http://schemas.openxmlformats.org/drawingml/2006/picture">
                   <pic:nvPicPr>
-                    <pic:cNvPr id="12" name="Picture 6" descr="Design Flowchart In Programming (With Examples) - Programiz">
-                      <a:extLst>
-                        <a:ext uri="{FF2B5EF4-FFF2-40B4-BE49-F238E27FC236}">
-                          <a16:creationId xmlns:a16="http://schemas.microsoft.com/office/drawing/2014/main" id="{2CA6C09E-F21A-CF4F-B9F3-CBA5AC84A555}"/>
-                        </a:ext>
-                      </a:extLst>
-                    </pic:cNvPr>
-                    <pic:cNvPicPr>
-                      <a:picLocks noChangeAspect="1" noChangeArrowheads="1"/>
-                    </pic:cNvPicPr>
+                    <pic:cNvPr id="1480246914" name="Picture 1" descr="The image depicts a circuit diagram with various components including LEDs, microcontrollers (UART TX, RX, GP25, GP1, GP2, GP3, GP4, GP5, GP28, GP27, GP26, GP22), and various input/output connections such as SPI, SDA, SCL, VSYS, and ADC.&#10;&#10;AI-generated content may be incorrect."/>
+                    <pic:cNvPicPr/>
                   </pic:nvPicPr>
                   <pic:blipFill>
                     <a:blip r:embed="rId5" cstate="print">
@@ -472,464 +527,709 @@
                         </a:ext>
                       </a:extLst>
                     </a:blip>
-                    <a:srcRect/>
                     <a:stretch>
                       <a:fillRect/>
                     </a:stretch>
                   </pic:blipFill>
-                  <pic:spPr bwMode="auto">
+                  <pic:spPr>
                     <a:xfrm>
                       <a:off x="0" y="0"/>
-                      <a:ext cx="1994535" cy="1795145"/>
+                      <a:ext cx="4450715" cy="2391410"/>
                     </a:xfrm>
                     <a:prstGeom prst="rect">
                       <a:avLst/>
                     </a:prstGeom>
-                    <a:noFill/>
                   </pic:spPr>
                 </pic:pic>
               </a:graphicData>
             </a:graphic>
-            <wp14:sizeRelH relativeFrom="page">
-              <wp14:pctWidth>0</wp14:pctWidth>
-            </wp14:sizeRelH>
-            <wp14:sizeRelV relativeFrom="page">
-              <wp14:pctHeight>0</wp14:pctHeight>
-            </wp14:sizeRelV>
-          </wp:anchor>
+          </wp:inline>
         </w:drawing>
       </w:r>
+    </w:p>
+    <w:p>
+      <w:pPr>
+        <w:pStyle w:val="Caption"/>
+        <w:jc w:val="center"/>
+        <w:rPr>
+          <w:sz w:val="22"/>
+          <w:szCs w:val="22"/>
+        </w:rPr>
+      </w:pPr>
+      <w:r>
+        <w:rPr>
+          <w:sz w:val="22"/>
+          <w:szCs w:val="22"/>
+        </w:rPr>
+        <w:t xml:space="preserve">Figure </w:t>
+      </w:r>
+      <w:r>
+        <w:rPr>
+          <w:sz w:val="22"/>
+          <w:szCs w:val="22"/>
+        </w:rPr>
+        <w:fldChar w:fldCharType="begin"/>
+      </w:r>
+      <w:r>
+        <w:rPr>
+          <w:sz w:val="22"/>
+          <w:szCs w:val="22"/>
+        </w:rPr>
+        <w:instrText xml:space="preserve"> SEQ Figure \* ARABIC </w:instrText>
+      </w:r>
+      <w:r>
+        <w:rPr>
+          <w:sz w:val="22"/>
+          <w:szCs w:val="22"/>
+        </w:rPr>
+        <w:fldChar w:fldCharType="separate"/>
+      </w:r>
+      <w:r>
+        <w:rPr>
+          <w:noProof/>
+          <w:sz w:val="22"/>
+          <w:szCs w:val="22"/>
+        </w:rPr>
+        <w:t>1</w:t>
+      </w:r>
+      <w:r>
+        <w:rPr>
+          <w:sz w:val="22"/>
+          <w:szCs w:val="22"/>
+        </w:rPr>
+        <w:fldChar w:fldCharType="end"/>
+      </w:r>
+      <w:r>
+        <w:rPr>
+          <w:sz w:val="22"/>
+          <w:szCs w:val="22"/>
+        </w:rPr>
+        <w:t>: Raspberry Pi Pico 2 Pinout</w:t>
+      </w:r>
+    </w:p>
+    <w:p>
+      <w:pPr>
+        <w:pStyle w:val="Caption"/>
+        <w:jc w:val="center"/>
+      </w:pPr>
+    </w:p>
+    <w:p>
+      <w:pPr>
+        <w:pStyle w:val="Caption"/>
+        <w:keepNext/>
+        <w:ind w:right="-288"/>
+        <w:jc w:val="center"/>
+      </w:pPr>
+      <w:r>
+        <w:lastRenderedPageBreak/>
+        <w:drawing>
+          <wp:inline distT="0" distB="0" distL="0" distR="0" wp14:anchorId="1E044D3A" wp14:editId="4A976402">
+            <wp:extent cx="4613666" cy="2746513"/>
+            <wp:effectExtent l="0" t="0" r="0" b="0"/>
+            <wp:docPr id="1517462790" name="Picture 1" descr="The image depicts a circuit diagram with various components including LEDs, UART, SPI, GPIO, and power connections, along with labels for different functionalities such as voltage regulation and debugging.&#10;&#10;AI-generated content may be incorrect."/>
+            <wp:cNvGraphicFramePr>
+              <a:graphicFrameLocks xmlns:a="http://schemas.openxmlformats.org/drawingml/2006/main" noChangeAspect="1"/>
+            </wp:cNvGraphicFramePr>
+            <a:graphic xmlns:a="http://schemas.openxmlformats.org/drawingml/2006/main">
+              <a:graphicData uri="http://schemas.openxmlformats.org/drawingml/2006/picture">
+                <pic:pic xmlns:pic="http://schemas.openxmlformats.org/drawingml/2006/picture">
+                  <pic:nvPicPr>
+                    <pic:cNvPr id="1517462790" name="Picture 1" descr="The image depicts a circuit diagram with various components including LEDs, UART, SPI, GPIO, and power connections, along with labels for different functionalities such as voltage regulation and debugging.&#10;&#10;AI-generated content may be incorrect."/>
+                    <pic:cNvPicPr/>
+                  </pic:nvPicPr>
+                  <pic:blipFill>
+                    <a:blip r:embed="rId6"/>
+                    <a:stretch>
+                      <a:fillRect/>
+                    </a:stretch>
+                  </pic:blipFill>
+                  <pic:spPr>
+                    <a:xfrm>
+                      <a:off x="0" y="0"/>
+                      <a:ext cx="4654905" cy="2771063"/>
+                    </a:xfrm>
+                    <a:prstGeom prst="rect">
+                      <a:avLst/>
+                    </a:prstGeom>
+                  </pic:spPr>
+                </pic:pic>
+              </a:graphicData>
+            </a:graphic>
+          </wp:inline>
+        </w:drawing>
+      </w:r>
+    </w:p>
+    <w:p>
+      <w:pPr>
+        <w:pStyle w:val="Caption"/>
+        <w:jc w:val="center"/>
+        <w:rPr>
+          <w:sz w:val="22"/>
+          <w:szCs w:val="22"/>
+        </w:rPr>
+      </w:pPr>
+      <w:r>
+        <w:rPr>
+          <w:sz w:val="22"/>
+          <w:szCs w:val="22"/>
+        </w:rPr>
+        <w:t xml:space="preserve">Figure </w:t>
+      </w:r>
+      <w:r>
+        <w:rPr>
+          <w:sz w:val="22"/>
+          <w:szCs w:val="22"/>
+        </w:rPr>
+        <w:fldChar w:fldCharType="begin"/>
+      </w:r>
+      <w:r>
+        <w:rPr>
+          <w:sz w:val="22"/>
+          <w:szCs w:val="22"/>
+        </w:rPr>
+        <w:instrText xml:space="preserve"> SEQ Figure \* ARABIC </w:instrText>
+      </w:r>
+      <w:r>
+        <w:rPr>
+          <w:sz w:val="22"/>
+          <w:szCs w:val="22"/>
+        </w:rPr>
+        <w:fldChar w:fldCharType="separate"/>
+      </w:r>
+      <w:r>
+        <w:rPr>
+          <w:noProof/>
+          <w:sz w:val="22"/>
+          <w:szCs w:val="22"/>
+        </w:rPr>
+        <w:t>2</w:t>
+      </w:r>
+      <w:r>
+        <w:rPr>
+          <w:sz w:val="22"/>
+          <w:szCs w:val="22"/>
+        </w:rPr>
+        <w:fldChar w:fldCharType="end"/>
+      </w:r>
+      <w:r>
+        <w:rPr>
+          <w:sz w:val="22"/>
+          <w:szCs w:val="22"/>
+        </w:rPr>
+        <w:t>: Raspberry Pi Pico 2 W Pinout</w:t>
+      </w:r>
+    </w:p>
+    <w:p>
+      <w:pPr>
+        <w:pStyle w:val="Caption"/>
+      </w:pPr>
+    </w:p>
+    <w:p>
+      <w:pPr>
+        <w:pStyle w:val="Caption"/>
+        <w:rPr>
+          <w:i w:val="0"/>
+          <w:iCs w:val="0"/>
+          <w:sz w:val="22"/>
+          <w:szCs w:val="22"/>
+        </w:rPr>
+      </w:pPr>
+      <w:r>
+        <w:rPr>
+          <w:sz w:val="22"/>
+          <w:szCs w:val="22"/>
+        </w:rPr>
+        <w:tab/>
+      </w:r>
+      <w:r>
+        <w:rPr>
+          <w:i w:val="0"/>
+          <w:iCs w:val="0"/>
+          <w:sz w:val="22"/>
+          <w:szCs w:val="22"/>
+        </w:rPr>
+        <w:t xml:space="preserve">Apart from the microcontroller, the switch, piezo, and LED were the most important devices used for this lab. The LED is simple since it is a direct semiconductor that releases energy primarily as light which is useful for the case of the Red LED used in this lab. The switch is a device that can open/close circuit connections. The switch used was wired in active-high configuration as shown in the image below. An </w:t>
+      </w:r>
+      <w:r>
+        <w:rPr>
+          <w:b/>
+          <w:bCs/>
+          <w:i w:val="0"/>
+          <w:iCs w:val="0"/>
+          <w:sz w:val="22"/>
+          <w:szCs w:val="22"/>
+        </w:rPr>
+        <w:t>active-high</w:t>
+      </w:r>
+      <w:r>
+        <w:rPr>
+          <w:b/>
+          <w:bCs/>
+          <w:i w:val="0"/>
+          <w:iCs w:val="0"/>
+          <w:sz w:val="22"/>
+          <w:szCs w:val="22"/>
+        </w:rPr>
+        <w:t>/pullup</w:t>
+      </w:r>
+      <w:r>
+        <w:rPr>
+          <w:i w:val="0"/>
+          <w:iCs w:val="0"/>
+          <w:sz w:val="22"/>
+          <w:szCs w:val="22"/>
+        </w:rPr>
+        <w:t xml:space="preserve"> switch configuration defaults to VCC/HIGH (the supply voltage) when the circuit is open, the switch is not </w:t>
+      </w:r>
+      <w:r>
+        <w:rPr>
+          <w:i w:val="0"/>
+          <w:iCs w:val="0"/>
+          <w:sz w:val="22"/>
+          <w:szCs w:val="22"/>
+        </w:rPr>
+        <w:t>pressed</w:t>
+      </w:r>
+      <w:r>
+        <w:rPr>
+          <w:i w:val="0"/>
+          <w:iCs w:val="0"/>
+          <w:sz w:val="22"/>
+          <w:szCs w:val="22"/>
+        </w:rPr>
+        <w:t xml:space="preserve">, and </w:t>
+      </w:r>
+      <w:r>
+        <w:rPr>
+          <w:i w:val="0"/>
+          <w:iCs w:val="0"/>
+          <w:sz w:val="22"/>
+          <w:szCs w:val="22"/>
+        </w:rPr>
+        <w:t xml:space="preserve">GND/LOW when the circuit is closed, the switch is pressed. This is advantageous because it can both provide a default state for a signal and save energy as power is only dissipated across a resistor when the switch is pressed as no current passes through the resistor in the default case. </w:t>
+      </w:r>
+      <w:r>
+        <w:rPr>
+          <w:i w:val="0"/>
+          <w:iCs w:val="0"/>
+          <w:sz w:val="22"/>
+          <w:szCs w:val="22"/>
+        </w:rPr>
+        <w:t xml:space="preserve">Additionally, switches are often made badly, so they bounce, oscillate in value before settling at a final value, so they require </w:t>
+      </w:r>
+      <w:r>
+        <w:rPr>
+          <w:b/>
+          <w:bCs/>
+          <w:i w:val="0"/>
+          <w:iCs w:val="0"/>
+          <w:sz w:val="22"/>
+          <w:szCs w:val="22"/>
+        </w:rPr>
+        <w:t xml:space="preserve">debouncing </w:t>
+      </w:r>
+      <w:r>
+        <w:rPr>
+          <w:i w:val="0"/>
+          <w:iCs w:val="0"/>
+          <w:sz w:val="22"/>
+          <w:szCs w:val="22"/>
+        </w:rPr>
+        <w:t>which can be done via several methods, but</w:t>
+      </w:r>
+      <w:r>
+        <w:rPr>
+          <w:b/>
+          <w:bCs/>
+          <w:i w:val="0"/>
+          <w:iCs w:val="0"/>
+          <w:sz w:val="22"/>
+          <w:szCs w:val="22"/>
+        </w:rPr>
+        <w:t xml:space="preserve"> hardware interrupts are the most common. </w:t>
+      </w:r>
+      <w:r>
+        <w:rPr>
+          <w:i w:val="0"/>
+          <w:iCs w:val="0"/>
+          <w:sz w:val="22"/>
+          <w:szCs w:val="22"/>
+        </w:rPr>
+        <w:t xml:space="preserve">The </w:t>
+      </w:r>
+      <w:r>
+        <w:rPr>
+          <w:i w:val="0"/>
+          <w:iCs w:val="0"/>
+          <w:sz w:val="22"/>
+          <w:szCs w:val="22"/>
+        </w:rPr>
+        <w:t>last</w:t>
+      </w:r>
+      <w:r>
+        <w:rPr>
+          <w:i w:val="0"/>
+          <w:iCs w:val="0"/>
+          <w:sz w:val="22"/>
+          <w:szCs w:val="22"/>
+        </w:rPr>
+        <w:t xml:space="preserve"> important component in this design is the piezo buzzer which implements the fundamental piezoelectric effect but in reverse. Instead of a device under mechanical pressure producing electrical charge, the </w:t>
+      </w:r>
+      <w:r>
+        <w:rPr>
+          <w:i w:val="0"/>
+          <w:iCs w:val="0"/>
+          <w:sz w:val="22"/>
+          <w:szCs w:val="22"/>
+        </w:rPr>
+        <w:t xml:space="preserve">presence of electrical charge deforms a mechanical device and causes it to produce sound [5]. This is a simple explanation of each of these devices, but their specs are not vital in understanding the design flow of this project. </w:t>
+      </w:r>
+    </w:p>
+    <w:p>
+      <w:pPr>
+        <w:pStyle w:val="Caption"/>
+        <w:rPr>
+          <w:i w:val="0"/>
+          <w:iCs w:val="0"/>
+          <w:sz w:val="22"/>
+          <w:szCs w:val="22"/>
+        </w:rPr>
+      </w:pPr>
+      <w:r>
+        <w:rPr>
+          <w:i w:val="0"/>
+          <w:iCs w:val="0"/>
+          <w:sz w:val="22"/>
+          <w:szCs w:val="22"/>
+        </w:rPr>
+        <w:tab/>
+      </w:r>
+      <w:r>
+        <w:rPr>
+          <w:b/>
+          <w:bCs/>
+          <w:i w:val="0"/>
+          <w:iCs w:val="0"/>
+          <w:sz w:val="22"/>
+          <w:szCs w:val="22"/>
+        </w:rPr>
+        <w:t>Hardware interrupts</w:t>
+      </w:r>
+      <w:r>
+        <w:rPr>
+          <w:b/>
+          <w:bCs/>
+          <w:i w:val="0"/>
+          <w:iCs w:val="0"/>
+          <w:sz w:val="22"/>
+          <w:szCs w:val="22"/>
+        </w:rPr>
+        <w:t xml:space="preserve"> </w:t>
+      </w:r>
+      <w:r>
+        <w:rPr>
+          <w:i w:val="0"/>
+          <w:iCs w:val="0"/>
+          <w:sz w:val="22"/>
+          <w:szCs w:val="22"/>
+        </w:rPr>
+        <w:t xml:space="preserve">are the most common way to debounce switches because of how accurate they can be. Interrupts are . </w:t>
+      </w:r>
+    </w:p>
+    <w:p>
+      <w:pPr>
+        <w:pStyle w:val="Caption"/>
+        <w:rPr>
+          <w:i w:val="0"/>
+          <w:iCs w:val="0"/>
+        </w:rPr>
+      </w:pPr>
+    </w:p>
+    <w:p>
+      <w:pPr>
+        <w:pStyle w:val="Caption"/>
+        <w:keepNext/>
+        <w:jc w:val="center"/>
+      </w:pPr>
+      <w:r>
+        <w:rPr>
+          <w:noProof/>
+        </w:rPr>
+        <w:lastRenderedPageBreak/>
+        <w:drawing>
+          <wp:inline distT="0" distB="0" distL="0" distR="0" wp14:anchorId="377890C8" wp14:editId="386886A9">
+            <wp:extent cx="2653748" cy="2681535"/>
+            <wp:effectExtent l="0" t="0" r="0" b="5080"/>
+            <wp:docPr id="1914660575" name="Picture 5" descr="The image depicts a simple electronic circuit diagram with a power supply (Vcc) and a control unit (PD), and a control signal (A).&#10;&#10;AI-generated content may be incorrect."/>
+            <wp:cNvGraphicFramePr>
+              <a:graphicFrameLocks xmlns:a="http://schemas.openxmlformats.org/drawingml/2006/main" noChangeAspect="1"/>
+            </wp:cNvGraphicFramePr>
+            <a:graphic xmlns:a="http://schemas.openxmlformats.org/drawingml/2006/main">
+              <a:graphicData uri="http://schemas.openxmlformats.org/drawingml/2006/picture">
+                <pic:pic xmlns:pic="http://schemas.openxmlformats.org/drawingml/2006/picture">
+                  <pic:nvPicPr>
+                    <pic:cNvPr id="1914660575" name="Picture 5" descr="The image depicts a simple electronic circuit diagram with a power supply (Vcc) and a control unit (PD), and a control signal (A).&#10;&#10;AI-generated content may be incorrect."/>
+                    <pic:cNvPicPr/>
+                  </pic:nvPicPr>
+                  <pic:blipFill>
+                    <a:blip r:embed="rId7" cstate="print">
+                      <a:extLst>
+                        <a:ext uri="{28A0092B-C50C-407E-A947-70E740481C1C}">
+                          <a14:useLocalDpi xmlns:a14="http://schemas.microsoft.com/office/drawing/2010/main" val="0"/>
+                        </a:ext>
+                      </a:extLst>
+                    </a:blip>
+                    <a:stretch>
+                      <a:fillRect/>
+                    </a:stretch>
+                  </pic:blipFill>
+                  <pic:spPr>
+                    <a:xfrm>
+                      <a:off x="0" y="0"/>
+                      <a:ext cx="2692269" cy="2720459"/>
+                    </a:xfrm>
+                    <a:prstGeom prst="rect">
+                      <a:avLst/>
+                    </a:prstGeom>
+                  </pic:spPr>
+                </pic:pic>
+              </a:graphicData>
+            </a:graphic>
+          </wp:inline>
+        </w:drawing>
+      </w:r>
+    </w:p>
+    <w:p>
+      <w:pPr>
+        <w:pStyle w:val="Caption"/>
+        <w:jc w:val="center"/>
+        <w:rPr>
+          <w:sz w:val="22"/>
+          <w:szCs w:val="22"/>
+        </w:rPr>
+      </w:pPr>
+      <w:r>
+        <w:rPr>
+          <w:sz w:val="22"/>
+          <w:szCs w:val="22"/>
+        </w:rPr>
+        <w:t xml:space="preserve">Figure </w:t>
+      </w:r>
+      <w:r>
+        <w:rPr>
+          <w:sz w:val="22"/>
+          <w:szCs w:val="22"/>
+        </w:rPr>
+        <w:fldChar w:fldCharType="begin"/>
+      </w:r>
+      <w:r>
+        <w:rPr>
+          <w:sz w:val="22"/>
+          <w:szCs w:val="22"/>
+        </w:rPr>
+        <w:instrText xml:space="preserve"> SEQ Figure \* ARABIC </w:instrText>
+      </w:r>
+      <w:r>
+        <w:rPr>
+          <w:sz w:val="22"/>
+          <w:szCs w:val="22"/>
+        </w:rPr>
+        <w:fldChar w:fldCharType="separate"/>
+      </w:r>
+      <w:r>
+        <w:rPr>
+          <w:noProof/>
+          <w:sz w:val="22"/>
+          <w:szCs w:val="22"/>
+        </w:rPr>
+        <w:t>3</w:t>
+      </w:r>
+      <w:r>
+        <w:rPr>
+          <w:sz w:val="22"/>
+          <w:szCs w:val="22"/>
+        </w:rPr>
+        <w:fldChar w:fldCharType="end"/>
+      </w:r>
+      <w:r>
+        <w:rPr>
+          <w:sz w:val="22"/>
+          <w:szCs w:val="22"/>
+        </w:rPr>
+        <w:t>: Pullup (PU) and Pulldown (PD) Switch Configurations</w:t>
+      </w:r>
+    </w:p>
+    <w:p>
+      <w:pPr>
+        <w:keepNext/>
+        <w:spacing w:after="0"/>
+        <w:rPr>
+          <w:sz w:val="24"/>
+          <w:szCs w:val="24"/>
+        </w:rPr>
+      </w:pPr>
+    </w:p>
+    <w:p>
+      <w:pPr>
+        <w:pStyle w:val="ListParagraph"/>
+        <w:keepNext/>
+        <w:spacing w:after="0"/>
+        <w:ind w:left="0"/>
+        <w:rPr>
+          <w:sz w:val="24"/>
+          <w:szCs w:val="24"/>
+          <w:u w:val="single"/>
+        </w:rPr>
+      </w:pPr>
+      <w:r>
+        <w:rPr>
+          <w:sz w:val="24"/>
+          <w:szCs w:val="24"/>
+          <w:u w:val="single"/>
+        </w:rPr>
+        <w:t>Design Process Methodology</w:t>
+      </w:r>
+      <w:r>
+        <w:rPr>
+          <w:sz w:val="24"/>
+          <w:szCs w:val="24"/>
+          <w:u w:val="single"/>
+        </w:rPr>
+        <w:t>:</w:t>
+      </w:r>
+    </w:p>
+    <w:p>
+      <w:pPr>
+        <w:pStyle w:val="ListParagraph"/>
+        <w:keepNext/>
+        <w:spacing w:after="0"/>
+        <w:ind w:left="1080"/>
+      </w:pPr>
+    </w:p>
+    <w:p>
+      <w:pPr>
+        <w:pStyle w:val="ListParagraph"/>
+        <w:keepNext/>
+        <w:spacing w:after="0"/>
+        <w:ind w:left="1080"/>
+      </w:pPr>
       <w:r>
         <w:rPr>
           <w:i/>
           <w:iCs/>
           <w:noProof/>
-          <w:sz w:val="24"/>
-        </w:rPr>
-        <mc:AlternateContent>
-          <mc:Choice Requires="wps">
-            <w:drawing>
-              <wp:anchor distT="0" distB="0" distL="114300" distR="114300" simplePos="0" relativeHeight="251661312" behindDoc="0" locked="0" layoutInCell="1" allowOverlap="1" wp14:anchorId="38F69859" wp14:editId="397F93D2">
-                <wp:simplePos x="0" y="0"/>
-                <wp:positionH relativeFrom="column">
-                  <wp:posOffset>3103245</wp:posOffset>
-                </wp:positionH>
-                <wp:positionV relativeFrom="paragraph">
-                  <wp:posOffset>173934</wp:posOffset>
-                </wp:positionV>
-                <wp:extent cx="2301875" cy="2145665"/>
-                <wp:effectExtent l="0" t="0" r="0" b="0"/>
-                <wp:wrapSquare wrapText="bothSides"/>
-                <wp:docPr id="2" name="Text Box 2"/>
-                <wp:cNvGraphicFramePr/>
-                <a:graphic xmlns:a="http://schemas.openxmlformats.org/drawingml/2006/main">
-                  <a:graphicData uri="http://schemas.microsoft.com/office/word/2010/wordprocessingShape">
-                    <wps:wsp>
-                      <wps:cNvSpPr txBox="1"/>
-                      <wps:spPr>
-                        <a:xfrm>
-                          <a:off x="0" y="0"/>
-                          <a:ext cx="2301875" cy="2145665"/>
-                        </a:xfrm>
-                        <a:prstGeom prst="rect">
-                          <a:avLst/>
-                        </a:prstGeom>
-                        <a:noFill/>
-                        <a:ln w="6350">
-                          <a:noFill/>
-                        </a:ln>
-                      </wps:spPr>
-                      <wps:txbx>
-                        <w:txbxContent>
-                          <w:p/>
-                          <w:p>
-                            <w:pPr>
-                              <w:spacing w:line="240" w:lineRule="auto"/>
-                            </w:pPr>
-                          </w:p>
-                          <w:p/>
-                          <w:p/>
-                          <w:p/>
-                          <w:p>
-                            <w:pPr>
-                              <w:spacing w:line="240" w:lineRule="auto"/>
-                              <w:jc w:val="center"/>
-                            </w:pPr>
-                          </w:p>
-                          <w:p>
-                            <w:pPr>
-                              <w:spacing w:line="240" w:lineRule="auto"/>
-                              <w:jc w:val="center"/>
-                            </w:pPr>
-                            <w:r>
-                              <w:t>Fig.</w:t>
-                            </w:r>
-                            <w:r>
-                              <w:t>3</w:t>
-                            </w:r>
-                            <w:r>
-                              <w:t xml:space="preserve">. </w:t>
-                            </w:r>
-                            <w:r>
-                              <w:t xml:space="preserve">Ex. </w:t>
-                            </w:r>
-                            <w:r>
-                              <w:t>Software block diagram</w:t>
-                            </w:r>
-                          </w:p>
-                        </w:txbxContent>
-                      </wps:txbx>
-                      <wps:bodyPr rot="0" spcFirstLastPara="0" vertOverflow="overflow" horzOverflow="overflow" vert="horz" wrap="square" lIns="91440" tIns="45720" rIns="91440" bIns="45720" numCol="1" spcCol="0" rtlCol="0" fromWordArt="0" anchor="t" anchorCtr="0" forceAA="0" compatLnSpc="1">
-                        <a:prstTxWarp prst="textNoShape">
-                          <a:avLst/>
-                        </a:prstTxWarp>
-                        <a:noAutofit/>
-                      </wps:bodyPr>
-                    </wps:wsp>
-                  </a:graphicData>
-                </a:graphic>
-                <wp14:sizeRelV relativeFrom="margin">
-                  <wp14:pctHeight>0</wp14:pctHeight>
-                </wp14:sizeRelV>
-              </wp:anchor>
-            </w:drawing>
-          </mc:Choice>
-          <mc:Fallback>
-            <w:pict>
-              <v:shapetype w14:anchorId="38F69859" id="_x0000_t202" coordsize="21600,21600" o:spt="202" path="m,l,21600r21600,l21600,xe">
-                <v:stroke joinstyle="miter"/>
-                <v:path gradientshapeok="t" o:connecttype="rect"/>
-              </v:shapetype>
-              <v:shape id="Text Box 2" o:spid="_x0000_s1026" type="#_x0000_t202" style="position:absolute;left:0;text-align:left;margin-left:244.35pt;margin-top:13.7pt;width:181.25pt;height:168.95pt;z-index:251661312;visibility:visible;mso-wrap-style:square;mso-height-percent:0;mso-wrap-distance-left:9pt;mso-wrap-distance-top:0;mso-wrap-distance-right:9pt;mso-wrap-distance-bottom:0;mso-position-horizontal:absolute;mso-position-horizontal-relative:text;mso-position-vertical:absolute;mso-position-vertical-relative:text;mso-height-percent:0;mso-height-relative:margin;v-text-anchor:top" o:gfxdata="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" filled="f" stroked="f" strokeweight=".5pt">
-                <v:textbox>
-                  <w:txbxContent>
-                    <w:p/>
-                    <w:p>
-                      <w:pPr>
-                        <w:spacing w:line="240" w:lineRule="auto"/>
-                      </w:pPr>
-                    </w:p>
-                    <w:p/>
-                    <w:p/>
-                    <w:p/>
-                    <w:p>
-                      <w:pPr>
-                        <w:spacing w:line="240" w:lineRule="auto"/>
-                        <w:jc w:val="center"/>
-                      </w:pPr>
-                    </w:p>
-                    <w:p>
-                      <w:pPr>
-                        <w:spacing w:line="240" w:lineRule="auto"/>
-                        <w:jc w:val="center"/>
-                      </w:pPr>
-                      <w:r>
-                        <w:t>Fig.</w:t>
-                      </w:r>
-                      <w:r>
-                        <w:t>3</w:t>
-                      </w:r>
-                      <w:r>
-                        <w:t>.</w:t>
-                      </w:r>
-                      <w:r>
-                        <w:t xml:space="preserve"> </w:t>
-                      </w:r>
-                      <w:r>
-                        <w:t xml:space="preserve">Ex. </w:t>
-                      </w:r>
-                      <w:r>
-                        <w:t>Software</w:t>
-                      </w:r>
-                      <w:r>
-                        <w:t xml:space="preserve"> block diagram</w:t>
-                      </w:r>
-                    </w:p>
-                  </w:txbxContent>
-                </v:textbox>
-                <w10:wrap type="square"/>
-              </v:shape>
-            </w:pict>
-          </mc:Fallback>
-        </mc:AlternateContent>
-      </w:r>
-      <w:r>
-        <w:rPr>
-          <w:i/>
-          <w:iCs/>
+        </w:rPr>
+        <w:drawing>
+          <wp:inline distT="0" distB="0" distL="0" distR="0" wp14:anchorId="6FD6D2BD" wp14:editId="770C1BE7">
+            <wp:extent cx="4789170" cy="2899085"/>
+            <wp:effectExtent l="0" t="0" r="0" b="0"/>
+            <wp:docPr id="1485182056" name="Picture 1" descr="The image appears to be a schematic diagram of an electronic circuit, including various components such as buzzers, resistors, LEDs, and power supply connections.&#10;&#10;AI-generated content may be incorrect."/>
+            <wp:cNvGraphicFramePr>
+              <a:graphicFrameLocks xmlns:a="http://schemas.openxmlformats.org/drawingml/2006/main" noChangeAspect="1"/>
+            </wp:cNvGraphicFramePr>
+            <a:graphic xmlns:a="http://schemas.openxmlformats.org/drawingml/2006/main">
+              <a:graphicData uri="http://schemas.openxmlformats.org/drawingml/2006/picture">
+                <pic:pic xmlns:pic="http://schemas.openxmlformats.org/drawingml/2006/picture">
+                  <pic:nvPicPr>
+                    <pic:cNvPr id="1485182056" name="Picture 1" descr="The image appears to be a schematic diagram of an electronic circuit, including various components such as buzzers, resistors, LEDs, and power supply connections.&#10;&#10;AI-generated content may be incorrect."/>
+                    <pic:cNvPicPr/>
+                  </pic:nvPicPr>
+                  <pic:blipFill>
+                    <a:blip r:embed="rId8"/>
+                    <a:stretch>
+                      <a:fillRect/>
+                    </a:stretch>
+                  </pic:blipFill>
+                  <pic:spPr>
+                    <a:xfrm>
+                      <a:off x="0" y="0"/>
+                      <a:ext cx="4816842" cy="2915836"/>
+                    </a:xfrm>
+                    <a:prstGeom prst="rect">
+                      <a:avLst/>
+                    </a:prstGeom>
+                  </pic:spPr>
+                </pic:pic>
+              </a:graphicData>
+            </a:graphic>
+          </wp:inline>
+        </w:drawing>
+      </w:r>
+    </w:p>
+    <w:p>
+      <w:pPr>
+        <w:pStyle w:val="Caption"/>
+        <w:jc w:val="center"/>
+        <w:rPr>
+          <w:sz w:val="22"/>
+          <w:szCs w:val="22"/>
+        </w:rPr>
+      </w:pPr>
+      <w:r>
+        <w:rPr>
+          <w:sz w:val="22"/>
+          <w:szCs w:val="22"/>
+        </w:rPr>
+        <w:t xml:space="preserve">Figure </w:t>
+      </w:r>
+      <w:r>
+        <w:rPr>
+          <w:sz w:val="22"/>
+          <w:szCs w:val="22"/>
+        </w:rPr>
+        <w:fldChar w:fldCharType="begin"/>
+      </w:r>
+      <w:r>
+        <w:rPr>
+          <w:sz w:val="22"/>
+          <w:szCs w:val="22"/>
+        </w:rPr>
+        <w:instrText xml:space="preserve"> SEQ Figure \* ARABIC </w:instrText>
+      </w:r>
+      <w:r>
+        <w:rPr>
+          <w:sz w:val="22"/>
+          <w:szCs w:val="22"/>
+        </w:rPr>
+        <w:fldChar w:fldCharType="separate"/>
+      </w:r>
+      <w:r>
+        <w:rPr>
           <w:noProof/>
-          <w:sz w:val="24"/>
-        </w:rPr>
-        <mc:AlternateContent>
-          <mc:Choice Requires="wps">
-            <w:drawing>
-              <wp:anchor distT="0" distB="0" distL="114300" distR="114300" simplePos="0" relativeHeight="251659264" behindDoc="0" locked="0" layoutInCell="1" allowOverlap="1" wp14:anchorId="4AACC088" wp14:editId="2BC72A61">
-                <wp:simplePos x="0" y="0"/>
-                <wp:positionH relativeFrom="column">
-                  <wp:posOffset>509553</wp:posOffset>
-                </wp:positionH>
-                <wp:positionV relativeFrom="paragraph">
-                  <wp:posOffset>215265</wp:posOffset>
-                </wp:positionV>
-                <wp:extent cx="2301875" cy="2145665"/>
-                <wp:effectExtent l="0" t="0" r="0" b="0"/>
-                <wp:wrapSquare wrapText="bothSides"/>
-                <wp:docPr id="1" name="Text Box 1"/>
-                <wp:cNvGraphicFramePr/>
-                <a:graphic xmlns:a="http://schemas.openxmlformats.org/drawingml/2006/main">
-                  <a:graphicData uri="http://schemas.microsoft.com/office/word/2010/wordprocessingShape">
-                    <wps:wsp>
-                      <wps:cNvSpPr txBox="1"/>
-                      <wps:spPr>
-                        <a:xfrm>
-                          <a:off x="0" y="0"/>
-                          <a:ext cx="2301875" cy="2145665"/>
-                        </a:xfrm>
-                        <a:prstGeom prst="rect">
-                          <a:avLst/>
-                        </a:prstGeom>
-                        <a:noFill/>
-                        <a:ln w="6350">
-                          <a:noFill/>
-                        </a:ln>
-                      </wps:spPr>
-                      <wps:txbx>
-                        <w:txbxContent>
-                          <w:p>
-                            <w:r>
-                              <w:rPr>
-                                <w:i/>
-                                <w:iCs/>
-                                <w:noProof/>
-                                <w:sz w:val="24"/>
-                              </w:rPr>
-                              <w:drawing>
-                                <wp:inline distT="0" distB="0" distL="0" distR="0" wp14:anchorId="28F3594F" wp14:editId="04B97F80">
-                                  <wp:extent cx="2112645" cy="1626235"/>
-                                  <wp:effectExtent l="0" t="0" r="0" b="0"/>
-                                  <wp:docPr id="11" name="Picture 2" descr="Block diagram of control system hardware">
-                                    <a:extLst xmlns:a="http://schemas.openxmlformats.org/drawingml/2006/main">
-                                      <a:ext uri="{FF2B5EF4-FFF2-40B4-BE49-F238E27FC236}">
-                                        <a16:creationId xmlns:a16="http://schemas.microsoft.com/office/drawing/2014/main" id="{BD54BC61-ECDB-484E-97C7-5E5453EC2EC0}"/>
-                                      </a:ext>
-                                    </a:extLst>
-                                  </wp:docPr>
-                                  <wp:cNvGraphicFramePr>
-                                    <a:graphicFrameLocks xmlns:a="http://schemas.openxmlformats.org/drawingml/2006/main" noChangeAspect="1"/>
-                                  </wp:cNvGraphicFramePr>
-                                  <a:graphic xmlns:a="http://schemas.openxmlformats.org/drawingml/2006/main">
-                                    <a:graphicData uri="http://schemas.openxmlformats.org/drawingml/2006/picture">
-                                      <pic:pic xmlns:pic="http://schemas.openxmlformats.org/drawingml/2006/picture">
-                                        <pic:nvPicPr>
-                                          <pic:cNvPr id="11" name="Picture 2" descr="Block diagram of control system hardware">
-                                            <a:extLst>
-                                              <a:ext uri="{FF2B5EF4-FFF2-40B4-BE49-F238E27FC236}">
-                                                <a16:creationId xmlns:a16="http://schemas.microsoft.com/office/drawing/2014/main" id="{BD54BC61-ECDB-484E-97C7-5E5453EC2EC0}"/>
-                                              </a:ext>
-                                            </a:extLst>
-                                          </pic:cNvPr>
-                                          <pic:cNvPicPr>
-                                            <a:picLocks noChangeAspect="1" noChangeArrowheads="1"/>
-                                          </pic:cNvPicPr>
-                                        </pic:nvPicPr>
-                                        <pic:blipFill>
-                                          <a:blip r:embed="rId6">
-                                            <a:extLst>
-                                              <a:ext uri="{28A0092B-C50C-407E-A947-70E740481C1C}">
-                                                <a14:useLocalDpi xmlns:a14="http://schemas.microsoft.com/office/drawing/2010/main" val="0"/>
-                                              </a:ext>
-                                            </a:extLst>
-                                          </a:blip>
-                                          <a:srcRect/>
-                                          <a:stretch>
-                                            <a:fillRect/>
-                                          </a:stretch>
-                                        </pic:blipFill>
-                                        <pic:spPr bwMode="auto">
-                                          <a:xfrm>
-                                            <a:off x="0" y="0"/>
-                                            <a:ext cx="2112645" cy="1626235"/>
-                                          </a:xfrm>
-                                          <a:prstGeom prst="rect">
-                                            <a:avLst/>
-                                          </a:prstGeom>
-                                          <a:noFill/>
-                                        </pic:spPr>
-                                      </pic:pic>
-                                    </a:graphicData>
-                                  </a:graphic>
-                                </wp:inline>
-                              </w:drawing>
-                            </w:r>
-                          </w:p>
-                          <w:p>
-                            <w:pPr>
-                              <w:jc w:val="center"/>
-                            </w:pPr>
-                            <w:r>
-                              <w:t xml:space="preserve">Fig. </w:t>
-                            </w:r>
-                            <w:r>
-                              <w:t>2</w:t>
-                            </w:r>
-                            <w:r>
-                              <w:t xml:space="preserve">. </w:t>
-                            </w:r>
-                            <w:r>
-                              <w:t>Ex. h</w:t>
-                            </w:r>
-                            <w:r>
-                              <w:t>ardware block diagram.</w:t>
-                            </w:r>
-                          </w:p>
-                          <w:p/>
-                          <w:p/>
-                          <w:p/>
-                          <w:p>
-                            <w:pPr>
-                              <w:jc w:val="center"/>
-                            </w:pPr>
-                            <w:r>
-                              <w:t>Fig.1 Hardware block diagram</w:t>
-                            </w:r>
-                          </w:p>
-                        </w:txbxContent>
-                      </wps:txbx>
-                      <wps:bodyPr rot="0" spcFirstLastPara="0" vertOverflow="overflow" horzOverflow="overflow" vert="horz" wrap="square" lIns="91440" tIns="45720" rIns="91440" bIns="45720" numCol="1" spcCol="0" rtlCol="0" fromWordArt="0" anchor="t" anchorCtr="0" forceAA="0" compatLnSpc="1">
-                        <a:prstTxWarp prst="textNoShape">
-                          <a:avLst/>
-                        </a:prstTxWarp>
-                        <a:noAutofit/>
-                      </wps:bodyPr>
-                    </wps:wsp>
-                  </a:graphicData>
-                </a:graphic>
-                <wp14:sizeRelV relativeFrom="margin">
-                  <wp14:pctHeight>0</wp14:pctHeight>
-                </wp14:sizeRelV>
-              </wp:anchor>
-            </w:drawing>
-          </mc:Choice>
-          <mc:Fallback>
-            <w:pict>
-              <v:shape w14:anchorId="4AACC088" id="Text Box 1" o:spid="_x0000_s1027" type="#_x0000_t202" style="position:absolute;left:0;text-align:left;margin-left:40.1pt;margin-top:16.95pt;width:181.25pt;height:168.95pt;z-index:251659264;visibility:visible;mso-wrap-style:square;mso-height-percent:0;mso-wrap-distance-left:9pt;mso-wrap-distance-top:0;mso-wrap-distance-right:9pt;mso-wrap-distance-bottom:0;mso-position-horizontal:absolute;mso-position-horizontal-relative:text;mso-position-vertical:absolute;mso-position-vertical-relative:text;mso-height-percent:0;mso-height-relative:margin;v-text-anchor:top" o:gfxdata="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" filled="f" stroked="f" strokeweight=".5pt">
-                <v:textbox>
-                  <w:txbxContent>
-                    <w:p>
-                      <w:r>
-                        <w:rPr>
-                          <w:i/>
-                          <w:iCs/>
-                          <w:sz w:val="24"/>
-                        </w:rPr>
-                        <w:drawing>
-                          <wp:inline distT="0" distB="0" distL="0" distR="0" wp14:anchorId="28F3594F" wp14:editId="04B97F80">
-                            <wp:extent cx="2112645" cy="1626235"/>
-                            <wp:effectExtent l="0" t="0" r="0" b="0"/>
-                            <wp:docPr id="11" name="Picture 2" descr="Block diagram of control system hardware">
-                              <a:extLst xmlns:a="http://schemas.openxmlformats.org/drawingml/2006/main">
-                                <a:ext uri="{FF2B5EF4-FFF2-40B4-BE49-F238E27FC236}">
-                                  <a16:creationId xmlns:a16="http://schemas.microsoft.com/office/drawing/2014/main" id="{BD54BC61-ECDB-484E-97C7-5E5453EC2EC0}"/>
-                                </a:ext>
-                              </a:extLst>
-                            </wp:docPr>
-                            <wp:cNvGraphicFramePr>
-                              <a:graphicFrameLocks xmlns:a="http://schemas.openxmlformats.org/drawingml/2006/main" noChangeAspect="1"/>
-                            </wp:cNvGraphicFramePr>
-                            <a:graphic xmlns:a="http://schemas.openxmlformats.org/drawingml/2006/main">
-                              <a:graphicData uri="http://schemas.openxmlformats.org/drawingml/2006/picture">
-                                <pic:pic xmlns:pic="http://schemas.openxmlformats.org/drawingml/2006/picture">
-                                  <pic:nvPicPr>
-                                    <pic:cNvPr id="11" name="Picture 2" descr="Block diagram of control system hardware">
-                                      <a:extLst>
-                                        <a:ext uri="{FF2B5EF4-FFF2-40B4-BE49-F238E27FC236}">
-                                          <a16:creationId xmlns:a16="http://schemas.microsoft.com/office/drawing/2014/main" id="{BD54BC61-ECDB-484E-97C7-5E5453EC2EC0}"/>
-                                        </a:ext>
-                                      </a:extLst>
-                                    </pic:cNvPr>
-                                    <pic:cNvPicPr>
-                                      <a:picLocks noChangeAspect="1" noChangeArrowheads="1"/>
-                                    </pic:cNvPicPr>
-                                  </pic:nvPicPr>
-                                  <pic:blipFill>
-                                    <a:blip r:embed="rId7">
-                                      <a:extLst>
-                                        <a:ext uri="{28A0092B-C50C-407E-A947-70E740481C1C}">
-                                          <a14:useLocalDpi xmlns:a14="http://schemas.microsoft.com/office/drawing/2010/main" val="0"/>
-                                        </a:ext>
-                                      </a:extLst>
-                                    </a:blip>
-                                    <a:srcRect/>
-                                    <a:stretch>
-                                      <a:fillRect/>
-                                    </a:stretch>
-                                  </pic:blipFill>
-                                  <pic:spPr bwMode="auto">
-                                    <a:xfrm>
-                                      <a:off x="0" y="0"/>
-                                      <a:ext cx="2112645" cy="1626235"/>
-                                    </a:xfrm>
-                                    <a:prstGeom prst="rect">
-                                      <a:avLst/>
-                                    </a:prstGeom>
-                                    <a:noFill/>
-                                  </pic:spPr>
-                                </pic:pic>
-                              </a:graphicData>
-                            </a:graphic>
-                          </wp:inline>
-                        </w:drawing>
-                      </w:r>
-                    </w:p>
-                    <w:p>
-                      <w:pPr>
-                        <w:jc w:val="center"/>
-                      </w:pPr>
-                      <w:r>
-                        <w:t xml:space="preserve">Fig. </w:t>
-                      </w:r>
-                      <w:r>
-                        <w:t>2</w:t>
-                      </w:r>
-                      <w:r>
-                        <w:t xml:space="preserve">. </w:t>
-                      </w:r>
-                      <w:r>
-                        <w:t>Ex. h</w:t>
-                      </w:r>
-                      <w:r>
-                        <w:t>ardware block diagram.</w:t>
-                      </w:r>
-                    </w:p>
-                    <w:p/>
-                    <w:p/>
-                    <w:p/>
-                    <w:p>
-                      <w:pPr>
-                        <w:jc w:val="center"/>
-                      </w:pPr>
-                      <w:r>
-                        <w:t>Fig.1 Hardware block diagram</w:t>
-                      </w:r>
-                    </w:p>
-                  </w:txbxContent>
-                </v:textbox>
-                <w10:wrap type="square"/>
-              </v:shape>
-            </w:pict>
-          </mc:Fallback>
-        </mc:AlternateContent>
-      </w:r>
-    </w:p>
-    <w:p>
-      <w:pPr>
-        <w:pStyle w:val="ListParagraph"/>
-        <w:spacing w:after="0"/>
-        <w:ind w:left="1080"/>
-        <w:rPr>
-          <w:i/>
-          <w:iCs/>
-          <w:sz w:val="24"/>
+          <w:sz w:val="22"/>
+          <w:szCs w:val="22"/>
+        </w:rPr>
+        <w:t>4</w:t>
+      </w:r>
+      <w:r>
+        <w:rPr>
+          <w:noProof/>
+          <w:sz w:val="22"/>
+          <w:szCs w:val="22"/>
+        </w:rPr>
+        <w:fldChar w:fldCharType="end"/>
+      </w:r>
+      <w:r>
+        <w:rPr>
+          <w:sz w:val="22"/>
+          <w:szCs w:val="22"/>
+        </w:rPr>
+        <w:t>: Altium Schematic</w:t>
+      </w:r>
+    </w:p>
+    <w:p>
+      <w:pPr>
+        <w:pStyle w:val="Caption"/>
+        <w:jc w:val="center"/>
+      </w:pPr>
+    </w:p>
+    <w:p>
+      <w:pPr>
+        <w:pStyle w:val="Caption"/>
+        <w:jc w:val="center"/>
+        <w:rPr>
+          <w:i w:val="0"/>
+          <w:iCs w:val="0"/>
         </w:rPr>
       </w:pPr>
     </w:p>
@@ -958,7 +1258,7 @@
         <w:suppressAutoHyphens w:val="0"/>
         <w:spacing w:after="160" w:line="259" w:lineRule="auto"/>
       </w:pPr>
-      <w:hyperlink r:id="rId8" w:tgtFrame="_blank" w:history="1">
+      <w:hyperlink r:id="rId9" w:tgtFrame="_blank" w:history="1">
         <w:r>
           <w:rPr>
             <w:rStyle w:val="Hyperlink"/>
@@ -981,7 +1281,7 @@
           <w:u w:val="none"/>
         </w:rPr>
       </w:pPr>
-      <w:hyperlink r:id="rId9" w:tgtFrame="_blank" w:history="1">
+      <w:hyperlink r:id="rId10" w:tgtFrame="_blank" w:history="1">
         <w:r>
           <w:rPr>
             <w:rStyle w:val="Hyperlink"/>
@@ -1003,7 +1303,6 @@
         <w:rPr>
           <w:rStyle w:val="Hyperlink"/>
         </w:rPr>
-        <w:lastRenderedPageBreak/>
         <w:t xml:space="preserve">Free block diagram/flowchart editor: </w:t>
       </w:r>
       <w:r>
@@ -1012,7 +1311,7 @@
         </w:rPr>
         <w:t>https://app.</w:t>
       </w:r>
-      <w:hyperlink r:id="rId10" w:history="1">
+      <w:hyperlink r:id="rId11" w:history="1">
         <w:r>
           <w:rPr>
             <w:rStyle w:val="Hyperlink"/>
@@ -1286,7 +1585,19 @@
         <w:rPr>
           <w:sz w:val="24"/>
         </w:rPr>
-        <w:t>Figure of waveform at the LED output showing a 2 Hz square wave</w:t>
+        <w:t xml:space="preserve">Figure of waveform at the </w:t>
+      </w:r>
+      <w:r>
+        <w:rPr>
+          <w:sz w:val="24"/>
+        </w:rPr>
+        <w:t>LED</w:t>
+      </w:r>
+      <w:r>
+        <w:rPr>
+          <w:sz w:val="24"/>
+        </w:rPr>
+        <w:t xml:space="preserve"> output showing a 2 Hz square wave</w:t>
       </w:r>
     </w:p>
     <w:p>
@@ -1637,6 +1948,7 @@
           <w:sz w:val="24"/>
           <w:szCs w:val="24"/>
         </w:rPr>
+        <w:lastRenderedPageBreak/>
         <w:t>Please paste your code for the microcontroller in this section</w:t>
       </w:r>
       <w:r>
@@ -1668,6 +1980,208 @@
 <file path=word/numbering.xml><?xml version="1.0" encoding="utf-8"?>
 <w:numbering xmlns:wpc="http://schemas.microsoft.com/office/word/2010/wordprocessingCanvas" xmlns:cx="http://schemas.microsoft.com/office/drawing/2014/chartex" xmlns:cx1="http://schemas.microsoft.com/office/drawing/2015/9/8/chartex" xmlns:cx2="http://schemas.microsoft.com/office/drawing/2015/10/21/chartex" xmlns:cx3="http://schemas.microsoft.com/office/drawing/2016/5/9/chartex" xmlns:cx4="http://schemas.microsoft.com/office/drawing/2016/5/10/chartex" xmlns:cx5="http://schemas.microsoft.com/office/drawing/2016/5/11/chartex" xmlns:cx6="http://schemas.microsoft.com/office/drawing/2016/5/12/chartex" xmlns:cx7="http://schemas.microsoft.com/office/drawing/2016/5/13/chartex" xmlns:cx8="http://schemas.microsoft.com/office/drawing/2016/5/14/chartex" xmlns:mc="http://schemas.openxmlformats.org/markup-compatibility/2006" xmlns:aink="http://schemas.microsoft.com/office/drawing/2016/ink" xmlns:am3d="http://schemas.microsoft.com/office/drawing/2017/model3d" xmlns:o="urn:schemas-microsoft-com:office:office" xmlns:oel="http://schemas.microsoft.com/office/2019/extlst" xmlns:r="http://schemas.openxmlformats.org/officeDocument/2006/relationships" xmlns:m="http://schemas.openxmlformats.org/officeDocument/2006/math" xmlns:v="urn:schemas-microsoft-com:vml" xmlns:wp14="http://schemas.microsoft.com/office/word/2010/wordprocessingDrawing" xmlns:wp="http://schemas.openxmlformats.org/drawingml/2006/wordprocessingDrawing" xmlns:w10="urn:schemas-microsoft-com:office:word" xmlns:w="http://schemas.openxmlformats.org/wordprocessingml/2006/main" xmlns:w14="http://schemas.microsoft.com/office/word/2010/wordml" xmlns:w15="http://schemas.microsoft.com/office/word/2012/wordml" xmlns:w16cex="http://schemas.microsoft.com/office/word/2018/wordml/cex" xmlns:w16cid="http://schemas.microsoft.com/office/word/2016/wordml/cid" xmlns:w16="http://schemas.microsoft.com/office/word/2018/wordml" xmlns:w16du="http://schemas.microsoft.com/office/word/2023/wordml/word16du" xmlns:w16sdtdh="http://schemas.microsoft.com/office/word/2020/wordml/sdtdatahash" xmlns:w16sdtfl="http://schemas.microsoft.com/office/word/2024/wordml/sdtformatlock" xmlns:w16se="http://schemas.microsoft.com/office/word/2015/wordml/symex" xmlns:wpg="http://schemas.microsoft.com/office/word/2010/wordprocessingGroup" xmlns:wpi="http://schemas.microsoft.com/office/word/2010/wordprocessingInk" xmlns:wne="http://schemas.microsoft.com/office/word/2006/wordml" xmlns:wps="http://schemas.microsoft.com/office/word/2010/wordprocessingShape" mc:Ignorable="w14 w15 w16se w16cid w16 w16cex w16sdtdh w16sdtfl w16du wp14">
   <w:abstractNum w:abstractNumId="0" w15:restartNumberingAfterBreak="0">
+    <w:nsid w:val="077838F4"/>
+    <w:multiLevelType w:val="hybridMultilevel"/>
+    <w:tmpl w:val="1F369F90"/>
+    <w:lvl w:ilvl="0" w:tplc="17F695EC">
+      <w:start w:val="1"/>
+      <w:numFmt w:val="decimal"/>
+      <w:lvlText w:val="%1."/>
+      <w:lvlJc w:val="left"/>
+      <w:pPr>
+        <w:ind w:left="1440" w:hanging="360"/>
+      </w:pPr>
+      <w:rPr>
+        <w:rFonts w:hint="default"/>
+      </w:rPr>
+    </w:lvl>
+    <w:lvl w:ilvl="1" w:tplc="04090019" w:tentative="1">
+      <w:start w:val="1"/>
+      <w:numFmt w:val="lowerLetter"/>
+      <w:lvlText w:val="%2."/>
+      <w:lvlJc w:val="left"/>
+      <w:pPr>
+        <w:ind w:left="2160" w:hanging="360"/>
+      </w:pPr>
+    </w:lvl>
+    <w:lvl w:ilvl="2" w:tplc="0409001B" w:tentative="1">
+      <w:start w:val="1"/>
+      <w:numFmt w:val="lowerRoman"/>
+      <w:lvlText w:val="%3."/>
+      <w:lvlJc w:val="right"/>
+      <w:pPr>
+        <w:ind w:left="2880" w:hanging="180"/>
+      </w:pPr>
+    </w:lvl>
+    <w:lvl w:ilvl="3" w:tplc="0409000F" w:tentative="1">
+      <w:start w:val="1"/>
+      <w:numFmt w:val="decimal"/>
+      <w:lvlText w:val="%4."/>
+      <w:lvlJc w:val="left"/>
+      <w:pPr>
+        <w:ind w:left="3600" w:hanging="360"/>
+      </w:pPr>
+    </w:lvl>
+    <w:lvl w:ilvl="4" w:tplc="04090019" w:tentative="1">
+      <w:start w:val="1"/>
+      <w:numFmt w:val="lowerLetter"/>
+      <w:lvlText w:val="%5."/>
+      <w:lvlJc w:val="left"/>
+      <w:pPr>
+        <w:ind w:left="4320" w:hanging="360"/>
+      </w:pPr>
+    </w:lvl>
+    <w:lvl w:ilvl="5" w:tplc="0409001B" w:tentative="1">
+      <w:start w:val="1"/>
+      <w:numFmt w:val="lowerRoman"/>
+      <w:lvlText w:val="%6."/>
+      <w:lvlJc w:val="right"/>
+      <w:pPr>
+        <w:ind w:left="5040" w:hanging="180"/>
+      </w:pPr>
+    </w:lvl>
+    <w:lvl w:ilvl="6" w:tplc="0409000F" w:tentative="1">
+      <w:start w:val="1"/>
+      <w:numFmt w:val="decimal"/>
+      <w:lvlText w:val="%7."/>
+      <w:lvlJc w:val="left"/>
+      <w:pPr>
+        <w:ind w:left="5760" w:hanging="360"/>
+      </w:pPr>
+    </w:lvl>
+    <w:lvl w:ilvl="7" w:tplc="04090019" w:tentative="1">
+      <w:start w:val="1"/>
+      <w:numFmt w:val="lowerLetter"/>
+      <w:lvlText w:val="%8."/>
+      <w:lvlJc w:val="left"/>
+      <w:pPr>
+        <w:ind w:left="6480" w:hanging="360"/>
+      </w:pPr>
+    </w:lvl>
+    <w:lvl w:ilvl="8" w:tplc="0409001B" w:tentative="1">
+      <w:start w:val="1"/>
+      <w:numFmt w:val="lowerRoman"/>
+      <w:lvlText w:val="%9."/>
+      <w:lvlJc w:val="right"/>
+      <w:pPr>
+        <w:ind w:left="7200" w:hanging="180"/>
+      </w:pPr>
+    </w:lvl>
+  </w:abstractNum>
+  <w:abstractNum w:abstractNumId="1" w15:restartNumberingAfterBreak="0">
+    <w:nsid w:val="0EBB5962"/>
+    <w:multiLevelType w:val="hybridMultilevel"/>
+    <w:tmpl w:val="D0E6B0E8"/>
+    <w:lvl w:ilvl="0" w:tplc="04090001">
+      <w:start w:val="1"/>
+      <w:numFmt w:val="bullet"/>
+      <w:lvlText w:val=""/>
+      <w:lvlJc w:val="left"/>
+      <w:pPr>
+        <w:ind w:left="1440" w:hanging="360"/>
+      </w:pPr>
+      <w:rPr>
+        <w:rFonts w:ascii="Symbol" w:hAnsi="Symbol" w:hint="default"/>
+      </w:rPr>
+    </w:lvl>
+    <w:lvl w:ilvl="1" w:tplc="04090003">
+      <w:start w:val="1"/>
+      <w:numFmt w:val="bullet"/>
+      <w:lvlText w:val="o"/>
+      <w:lvlJc w:val="left"/>
+      <w:pPr>
+        <w:ind w:left="2160" w:hanging="360"/>
+      </w:pPr>
+      <w:rPr>
+        <w:rFonts w:ascii="Courier New" w:hAnsi="Courier New" w:cs="Courier New" w:hint="default"/>
+      </w:rPr>
+    </w:lvl>
+    <w:lvl w:ilvl="2" w:tplc="04090005">
+      <w:start w:val="1"/>
+      <w:numFmt w:val="bullet"/>
+      <w:lvlText w:val=""/>
+      <w:lvlJc w:val="left"/>
+      <w:pPr>
+        <w:ind w:left="2880" w:hanging="360"/>
+      </w:pPr>
+      <w:rPr>
+        <w:rFonts w:ascii="Wingdings" w:hAnsi="Wingdings" w:hint="default"/>
+      </w:rPr>
+    </w:lvl>
+    <w:lvl w:ilvl="3" w:tplc="04090001" w:tentative="1">
+      <w:start w:val="1"/>
+      <w:numFmt w:val="bullet"/>
+      <w:lvlText w:val=""/>
+      <w:lvlJc w:val="left"/>
+      <w:pPr>
+        <w:ind w:left="3600" w:hanging="360"/>
+      </w:pPr>
+      <w:rPr>
+        <w:rFonts w:ascii="Symbol" w:hAnsi="Symbol" w:hint="default"/>
+      </w:rPr>
+    </w:lvl>
+    <w:lvl w:ilvl="4" w:tplc="04090003" w:tentative="1">
+      <w:start w:val="1"/>
+      <w:numFmt w:val="bullet"/>
+      <w:lvlText w:val="o"/>
+      <w:lvlJc w:val="left"/>
+      <w:pPr>
+        <w:ind w:left="4320" w:hanging="360"/>
+      </w:pPr>
+      <w:rPr>
+        <w:rFonts w:ascii="Courier New" w:hAnsi="Courier New" w:cs="Courier New" w:hint="default"/>
+      </w:rPr>
+    </w:lvl>
+    <w:lvl w:ilvl="5" w:tplc="04090005" w:tentative="1">
+      <w:start w:val="1"/>
+      <w:numFmt w:val="bullet"/>
+      <w:lvlText w:val=""/>
+      <w:lvlJc w:val="left"/>
+      <w:pPr>
+        <w:ind w:left="5040" w:hanging="360"/>
+      </w:pPr>
+      <w:rPr>
+        <w:rFonts w:ascii="Wingdings" w:hAnsi="Wingdings" w:hint="default"/>
+      </w:rPr>
+    </w:lvl>
+    <w:lvl w:ilvl="6" w:tplc="04090001" w:tentative="1">
+      <w:start w:val="1"/>
+      <w:numFmt w:val="bullet"/>
+      <w:lvlText w:val=""/>
+      <w:lvlJc w:val="left"/>
+      <w:pPr>
+        <w:ind w:left="5760" w:hanging="360"/>
+      </w:pPr>
+      <w:rPr>
+        <w:rFonts w:ascii="Symbol" w:hAnsi="Symbol" w:hint="default"/>
+      </w:rPr>
+    </w:lvl>
+    <w:lvl w:ilvl="7" w:tplc="04090003" w:tentative="1">
+      <w:start w:val="1"/>
+      <w:numFmt w:val="bullet"/>
+      <w:lvlText w:val="o"/>
+      <w:lvlJc w:val="left"/>
+      <w:pPr>
+        <w:ind w:left="6480" w:hanging="360"/>
+      </w:pPr>
+      <w:rPr>
+        <w:rFonts w:ascii="Courier New" w:hAnsi="Courier New" w:cs="Courier New" w:hint="default"/>
+      </w:rPr>
+    </w:lvl>
+    <w:lvl w:ilvl="8" w:tplc="04090005" w:tentative="1">
+      <w:start w:val="1"/>
+      <w:numFmt w:val="bullet"/>
+      <w:lvlText w:val=""/>
+      <w:lvlJc w:val="left"/>
+      <w:pPr>
+        <w:ind w:left="7200" w:hanging="360"/>
+      </w:pPr>
+      <w:rPr>
+        <w:rFonts w:ascii="Wingdings" w:hAnsi="Wingdings" w:hint="default"/>
+      </w:rPr>
+    </w:lvl>
+  </w:abstractNum>
+  <w:abstractNum w:abstractNumId="2" w15:restartNumberingAfterBreak="0">
     <w:nsid w:val="1A642705"/>
     <w:multiLevelType w:val="hybridMultilevel"/>
     <w:tmpl w:val="67ACAC00"/>
@@ -1756,7 +2270,7 @@
       </w:pPr>
     </w:lvl>
   </w:abstractNum>
-  <w:abstractNum w:abstractNumId="1" w15:restartNumberingAfterBreak="0">
+  <w:abstractNum w:abstractNumId="3" w15:restartNumberingAfterBreak="0">
     <w:nsid w:val="24C00D1D"/>
     <w:multiLevelType w:val="multilevel"/>
     <w:tmpl w:val="99A4A6FE"/>
@@ -1905,7 +2419,7 @@
       </w:rPr>
     </w:lvl>
   </w:abstractNum>
-  <w:abstractNum w:abstractNumId="2" w15:restartNumberingAfterBreak="0">
+  <w:abstractNum w:abstractNumId="4" w15:restartNumberingAfterBreak="0">
     <w:nsid w:val="36BE5F31"/>
     <w:multiLevelType w:val="hybridMultilevel"/>
     <w:tmpl w:val="A74817B2"/>
@@ -1994,7 +2508,7 @@
       </w:pPr>
     </w:lvl>
   </w:abstractNum>
-  <w:abstractNum w:abstractNumId="3" w15:restartNumberingAfterBreak="0">
+  <w:abstractNum w:abstractNumId="5" w15:restartNumberingAfterBreak="0">
     <w:nsid w:val="54237EC1"/>
     <w:multiLevelType w:val="hybridMultilevel"/>
     <w:tmpl w:val="8216059E"/>
@@ -2083,7 +2597,7 @@
       </w:pPr>
     </w:lvl>
   </w:abstractNum>
-  <w:abstractNum w:abstractNumId="4" w15:restartNumberingAfterBreak="0">
+  <w:abstractNum w:abstractNumId="6" w15:restartNumberingAfterBreak="0">
     <w:nsid w:val="62452EC5"/>
     <w:multiLevelType w:val="hybridMultilevel"/>
     <w:tmpl w:val="D720A248"/>
@@ -2223,7 +2737,7 @@
       </w:rPr>
     </w:lvl>
   </w:abstractNum>
-  <w:abstractNum w:abstractNumId="5" w15:restartNumberingAfterBreak="0">
+  <w:abstractNum w:abstractNumId="7" w15:restartNumberingAfterBreak="0">
     <w:nsid w:val="660B10A8"/>
     <w:multiLevelType w:val="hybridMultilevel"/>
     <w:tmpl w:val="386609E4"/>
@@ -2337,21 +2851,27 @@
     </w:lvl>
   </w:abstractNum>
   <w:num w:numId="1" w16cid:durableId="1316375323">
+    <w:abstractNumId w:val="4"/>
+  </w:num>
+  <w:num w:numId="2" w16cid:durableId="1572159708">
+    <w:abstractNumId w:val="7"/>
+  </w:num>
+  <w:num w:numId="3" w16cid:durableId="1442187043">
+    <w:abstractNumId w:val="5"/>
+  </w:num>
+  <w:num w:numId="4" w16cid:durableId="1370648948">
+    <w:abstractNumId w:val="6"/>
+  </w:num>
+  <w:num w:numId="5" w16cid:durableId="793787168">
     <w:abstractNumId w:val="2"/>
   </w:num>
-  <w:num w:numId="2" w16cid:durableId="1572159708">
-    <w:abstractNumId w:val="5"/>
-  </w:num>
-  <w:num w:numId="3" w16cid:durableId="1442187043">
+  <w:num w:numId="6" w16cid:durableId="2000815124">
     <w:abstractNumId w:val="3"/>
   </w:num>
-  <w:num w:numId="4" w16cid:durableId="1370648948">
-    <w:abstractNumId w:val="4"/>
-  </w:num>
-  <w:num w:numId="5" w16cid:durableId="793787168">
+  <w:num w:numId="7" w16cid:durableId="1598052975">
     <w:abstractNumId w:val="0"/>
   </w:num>
-  <w:num w:numId="6" w16cid:durableId="2000815124">
+  <w:num w:numId="8" w16cid:durableId="1856918550">
     <w:abstractNumId w:val="1"/>
   </w:num>
 </w:numbering>
@@ -2760,10 +3280,30 @@
       <w:lang w:eastAsia="ar-SA"/>
     </w:rPr>
   </w:style>
+  <w:style w:type="paragraph" w:styleId="Heading1">
+    <w:name w:val="heading 1"/>
+    <w:basedOn w:val="Normal"/>
+    <w:next w:val="Normal"/>
+    <w:link w:val="Heading1Char"/>
+    <w:uiPriority w:val="9"/>
+    <w:qFormat/>
+    <w:rsid w:val="0068419D"/>
+    <w:pPr>
+      <w:keepNext/>
+      <w:keepLines/>
+      <w:spacing w:before="240" w:after="0"/>
+      <w:outlineLvl w:val="0"/>
+    </w:pPr>
+    <w:rPr>
+      <w:rFonts w:asciiTheme="majorHAnsi" w:eastAsiaTheme="majorEastAsia" w:hAnsiTheme="majorHAnsi" w:cstheme="majorBidi"/>
+      <w:color w:val="2F5496" w:themeColor="accent1" w:themeShade="BF"/>
+      <w:sz w:val="32"/>
+      <w:szCs w:val="32"/>
+    </w:rPr>
+  </w:style>
   <w:style w:type="character" w:default="1" w:styleId="DefaultParagraphFont">
     <w:name w:val="Default Paragraph Font"/>
     <w:uiPriority w:val="1"/>
-    <w:semiHidden/>
     <w:unhideWhenUsed/>
   </w:style>
   <w:style w:type="table" w:default="1" w:styleId="TableNormal">
@@ -2885,6 +3425,20 @@
     <w:rPr>
       <w:color w:val="605E5C"/>
       <w:shd w:val="clear" w:color="auto" w:fill="E1DFDD"/>
+    </w:rPr>
+  </w:style>
+  <w:style w:type="character" w:customStyle="1" w:styleId="Heading1Char">
+    <w:name w:val="Heading 1 Char"/>
+    <w:basedOn w:val="DefaultParagraphFont"/>
+    <w:link w:val="Heading1"/>
+    <w:uiPriority w:val="9"/>
+    <w:rsid w:val="0068419D"/>
+    <w:rPr>
+      <w:rFonts w:asciiTheme="majorHAnsi" w:eastAsiaTheme="majorEastAsia" w:hAnsiTheme="majorHAnsi" w:cstheme="majorBidi"/>
+      <w:color w:val="2F5496" w:themeColor="accent1" w:themeShade="BF"/>
+      <w:sz w:val="32"/>
+      <w:szCs w:val="32"/>
+      <w:lang w:eastAsia="ar-SA"/>
     </w:rPr>
   </w:style>
 </w:styles>

</xml_diff>